<commit_message>
Report, patent draft and VIT IDF-A/IDF-B forms with the full team and new results
- Report: team (S Naresh Nireenjan, Dharshan J, Sachin Saravanan S), guide Dr. Anusha N;
  new sections on CRC-16 (3.1, 6.9), the CRAWDAD real-world channel (3.7, 6.8),
  GuardCode-ML training size; updated implementation, database, dashboard and references
- IDF-A (inventors) and IDF-B (invention disclosure) generated from the results
  (docs/build/idf.js); unknown personal details left as [to be filled]
- Patent draft: inventor list and a dependent claim for the learned risk gate
- summarize.py: reads the new CSV format, adds CRAWDAD and CRC-16 pooled results
- docgen: headings keep with the next paragraph

Co-Authored-By: Claude Opus 5.5 <noreply@anthropic.com>
Claude-Session: https://claude.ai/code/session_01Jz5mTV9VNp6ybzdPShsnCo
</commit_message>
<xml_diff>
--- a/docs/GuardCode_Provisional_Patent_Draft.docx
+++ b/docs/GuardCode_Provisional_Patent_Draft.docx
@@ -109,16 +109,7 @@
     </w:p>
     <w:p>
       <w:pPr>
-        <w:spacing w:after="120" w:before="0"/>
-        <w:jc w:val="center"/>
-      </w:pPr>
-      <w:r>
-        <w:t xml:space="preserve">Naresh Nireenjan, Indian national, B.Tech (Computer Science and Engineering), School of Computer Science and Engineering, Vellore Institute of Technology, Vellore - 632014, Tamil Nadu, India</w:t>
-      </w:r>
-    </w:p>
-    <w:p>
-      <w:pPr>
-        <w:spacing w:after="360" w:before="0"/>
+        <w:spacing w:after="200" w:before="0"/>
         <w:jc w:val="center"/>
       </w:pPr>
       <w:r>
@@ -126,7 +117,38 @@
           <w:i/>
           <w:iCs/>
         </w:rPr>
-        <w:t xml:space="preserve">[Co-applicant / assignee details to be completed with the VIT IPR cell]</w:t>
+        <w:t xml:space="preserve">[Applicant / assignee to be confirmed with the VIT IPR&amp;TT Cell]</w:t>
+      </w:r>
+    </w:p>
+    <w:p>
+      <w:pPr>
+        <w:spacing w:after="80" w:before="0"/>
+        <w:jc w:val="center"/>
+      </w:pPr>
+      <w:r>
+        <w:rPr>
+          <w:b/>
+          <w:bCs/>
+        </w:rPr>
+        <w:t xml:space="preserve">INVENTORS</w:t>
+      </w:r>
+    </w:p>
+    <w:p>
+      <w:pPr>
+        <w:spacing w:after="60" w:before="0"/>
+        <w:jc w:val="center"/>
+      </w:pPr>
+      <w:r>
+        <w:t xml:space="preserve">Dr. Anusha N, Vellore Institute of Technology, Vellore - 632014, Tamil Nadu, India</w:t>
+      </w:r>
+    </w:p>
+    <w:p>
+      <w:pPr>
+        <w:spacing w:after="360" w:before="0"/>
+        <w:jc w:val="center"/>
+      </w:pPr>
+      <w:r>
+        <w:t xml:space="preserve">S Naresh Nireenjan (24BCE2353), Dharshan J (24BCE2335) and Sachin Saravanan S (24BCE2321), B.Tech (Computer Science and Engineering), School of Computer Science and Engineering, Vellore Institute of Technology, Vellore - 632014, Tamil Nadu, India</w:t>
       </w:r>
     </w:p>
     <w:p>
@@ -172,6 +194,7 @@
     <w:p>
       <w:pPr>
         <w:pStyle w:val="Heading1"/>
+        <w:keepNext/>
       </w:pPr>
       <w:r>
         <w:t xml:space="preserve">FIELD OF THE INVENTION</w:t>
@@ -189,6 +212,7 @@
     <w:p>
       <w:pPr>
         <w:pStyle w:val="Heading1"/>
+        <w:keepNext/>
       </w:pPr>
       <w:r>
         <w:t xml:space="preserve">BACKGROUND OF THE INVENTION</w:t>
@@ -243,6 +267,7 @@
     <w:p>
       <w:pPr>
         <w:pStyle w:val="Heading1"/>
+        <w:keepNext/>
       </w:pPr>
       <w:r>
         <w:t xml:space="preserve">OBJECTS OF THE INVENTION</w:t>
@@ -321,6 +346,7 @@
     <w:p>
       <w:pPr>
         <w:pStyle w:val="Heading1"/>
+        <w:keepNext/>
       </w:pPr>
       <w:r>
         <w:t xml:space="preserve">SUMMARY OF THE INVENTION</w:t>
@@ -411,6 +437,7 @@
     <w:p>
       <w:pPr>
         <w:pStyle w:val="Heading1"/>
+        <w:keepNext/>
       </w:pPr>
       <w:r>
         <w:t xml:space="preserve">BRIEF DESCRIPTION OF THE DRAWINGS</w:t>
@@ -585,6 +612,7 @@
     <w:p>
       <w:pPr>
         <w:pStyle w:val="Heading1"/>
+        <w:keepNext/>
       </w:pPr>
       <w:r>
         <w:t xml:space="preserve">DETAILED DESCRIPTION OF THE INVENTION</w:t>
@@ -593,6 +621,7 @@
     <w:p>
       <w:pPr>
         <w:pStyle w:val="Heading2"/>
+        <w:keepNext/>
       </w:pPr>
       <w:r>
         <w:t xml:space="preserve">1. Frame format and CRC parity-check matrix</w:t>
@@ -610,6 +639,7 @@
     <w:p>
       <w:pPr>
         <w:pStyle w:val="Heading2"/>
+        <w:keepNext/>
       </w:pPr>
       <w:r>
         <w:t xml:space="preserve">2. Soft-syndrome guard (107)</w:t>
@@ -636,6 +666,7 @@
     <w:p>
       <w:pPr>
         <w:pStyle w:val="Heading2"/>
+        <w:keepNext/>
       </w:pPr>
       <w:r>
         <w:t xml:space="preserve">3. Acceptance logic (108) and threshold selection</w:t>
@@ -653,6 +684,7 @@
     <w:p>
       <w:pPr>
         <w:pStyle w:val="Heading2"/>
+        <w:keepNext/>
       </w:pPr>
       <w:r>
         <w:t xml:space="preserve">4. Risk ledger (112)</w:t>
@@ -670,6 +702,7 @@
     <w:p>
       <w:pPr>
         <w:pStyle w:val="Heading2"/>
+        <w:keepNext/>
       </w:pPr>
       <w:r>
         <w:t xml:space="preserve">5. Learned channel code and decoder (103, 105)</w:t>
@@ -687,6 +720,7 @@
     <w:p>
       <w:pPr>
         <w:pStyle w:val="Heading2"/>
+        <w:keepNext/>
       </w:pPr>
       <w:r>
         <w:t xml:space="preserve">6. Channel-adaptive profile selection (110, 111)</w:t>
@@ -704,6 +738,7 @@
     <w:p>
       <w:pPr>
         <w:pStyle w:val="Heading2"/>
+        <w:keepNext/>
       </w:pPr>
       <w:r>
         <w:t xml:space="preserve">7. Experimental example</w:t>
@@ -2329,6 +2364,7 @@
     <w:p>
       <w:pPr>
         <w:pStyle w:val="Heading2"/>
+        <w:keepNext/>
       </w:pPr>
       <w:r>
         <w:t xml:space="preserve">8. Variants</w:t>
@@ -2407,6 +2443,7 @@
     <w:p>
       <w:pPr>
         <w:pStyle w:val="Heading1"/>
+        <w:keepNext/>
       </w:pPr>
       <w:r>
         <w:t xml:space="preserve">CLAIMS</w:t>
@@ -2603,6 +2640,20 @@
       </w:r>
     </w:p>
     <w:p>
+      <w:pPr>
+        <w:pStyle w:val="ListParagraph"/>
+        <w:numPr>
+          <w:ilvl w:val="0"/>
+          <w:numId w:val="4"/>
+        </w:numPr>
+        <w:spacing w:after="80" w:line="290"/>
+        <w:jc w:val="both"/>
+      </w:pPr>
+      <w:r>
+        <w:t xml:space="preserve">The method of claim 1, further comprising providing R(y), together with at least one further receiver-side feature selected from the minimum bit reliability, the per-group posterior confidences, the residual energy of the received symbols after re-encoding the decision and a burst index, to a trained classifier, and using the classifier output in place of R(y) for the acceptance decision, the classifier threshold being calibrated to the same retransmission budget.</w:t>
+      </w:r>
+    </w:p>
+    <w:p>
       <w:r>
         <w:br w:type="page"/>
       </w:r>
@@ -2610,6 +2661,7 @@
     <w:p>
       <w:pPr>
         <w:pStyle w:val="Heading1"/>
+        <w:keepNext/>
       </w:pPr>
       <w:r>
         <w:t xml:space="preserve">ABSTRACT</w:t>

</xml_diff>